<commit_message>
Reclassificar documento como Procedimento Gerencial e reformular Seção 5
- Ajustar título de "Procedimento Operacional Padrão" para "Procedimento Gerencial" (distinção formal OSID entre POP e Procedimento Gerencial)
- Reescrever Seção 5 em etapas numeradas de ação (5.1 a 5.7), no formato do modelo institucional (quem faz o quê, em sequência), substituindo a estrutura anterior de pilares/ciclo/escalonamento
- Atualizar código do documento (OSID-PG-QUAL-001) e histórico de revisões (v3.0)
- Regenerar versão .docx correspondente
Co-Authored-By: Claude Sonnet 5 <noreply@anthropic.com>
Claude-Session: https://claude.ai/code/session_013f2XRhDo2k4tpqWLL7XirX
</commit_message>
<xml_diff>
--- a/meu-projeto/POP-Qualidade-OSID.docx
+++ b/meu-projeto/POP-Qualidade-OSID.docx
@@ -53,7 +53,7 @@
           <w:sz w:val="40"/>
           <w:szCs w:val="40"/>
         </w:rPr>
-        <w:t xml:space="preserve">PROCEDIMENTO OPERACIONAL PADRÃO</w:t>
+        <w:t xml:space="preserve">PROCEDIMENTO GERENCIAL</w:t>
       </w:r>
     </w:p>
     <w:p>
@@ -86,7 +86,7 @@
           <w:sz w:val="22"/>
           <w:szCs w:val="22"/>
         </w:rPr>
-        <w:t xml:space="preserve">Código: OSID-POP-QUAL-001</w:t>
+        <w:t xml:space="preserve">Código: OSID-PG-QUAL-001</w:t>
       </w:r>
     </w:p>
     <w:p>
@@ -99,7 +99,7 @@
           <w:sz w:val="22"/>
           <w:szCs w:val="22"/>
         </w:rPr>
-        <w:t xml:space="preserve">Revisão: 2.0</w:t>
+        <w:t xml:space="preserve">Revisão: 3.0</w:t>
       </w:r>
     </w:p>
     <w:p>
@@ -841,7 +841,7 @@
                 <w:sz w:val="20"/>
                 <w:szCs w:val="20"/>
               </w:rPr>
-              <w:t xml:space="preserve">Conhecer este POP e o Protocolo Clínico Assistencial; aplicar os 7 pilares em todas as ações; engajar em monitoramento contínuo</w:t>
+              <w:t xml:space="preserve">Conhecer este Procedimento Gerencial e o Protocolo Clínico Assistencial; aplicar os 7 pilares em todas as ações; engajar em monitoramento contínuo</w:t>
             </w:r>
           </w:p>
         </w:tc>
@@ -2936,6 +2936,47 @@
     </w:p>
     <w:p>
       <w:pPr>
+        <w:spacing w:after="100" w:before="200"/>
+      </w:pPr>
+      <w:r>
+        <w:rPr>
+          <w:b/>
+          <w:bCs/>
+          <w:color w:val="2E5A87"/>
+          <w:sz w:val="21"/>
+          <w:szCs w:val="21"/>
+        </w:rPr>
+        <w:t xml:space="preserve">Fundamentos que orientam todas as etapas — Os 7 Pilares de Qualidade</w:t>
+      </w:r>
+    </w:p>
+    <w:p>
+      <w:pPr>
+        <w:spacing w:after="160" w:line="288"/>
+        <w:jc w:val="both"/>
+      </w:pPr>
+      <w:r>
+        <w:rPr>
+          <w:sz w:val="22"/>
+          <w:szCs w:val="22"/>
+        </w:rPr>
+        <w:t xml:space="preserve">Toda etapa deste procedimento é orientada por 7 pilares: (1) segurança do paciente; (2) excelência com recursos reais do SUS; (3) decisão colegiada e transparente; (4) equidade e respeito; (5) documentação e rastreabilidade; (6) integração multidisciplinar; (7) autonomia técnica da odontologia — o reconhecimento de que a saúde bucal é central para o sucesso do tratamento oncológico. Esses pilares não são uma etapa isolada; atravessam cada uma das etapas descritas a seguir.</w:t>
+      </w:r>
+    </w:p>
+    <w:p>
+      <w:pPr>
+        <w:spacing w:after="160" w:line="288"/>
+        <w:jc w:val="both"/>
+      </w:pPr>
+      <w:r>
+        <w:rPr>
+          <w:sz w:val="22"/>
+          <w:szCs w:val="22"/>
+        </w:rPr>
+        <w:t xml:space="preserve">As etapas abaixo descrevem, na ordem em que acontecem, como a qualidade do Serviço é definida, executada, monitorada e ajustada.</w:t>
+      </w:r>
+    </w:p>
+    <w:p>
+      <w:pPr>
         <w:pStyle w:val="Heading2"/>
         <w:spacing w:after="120" w:before="240"/>
       </w:pPr>
@@ -2947,51 +2988,7 @@
           <w:sz w:val="23"/>
           <w:szCs w:val="23"/>
         </w:rPr>
-        <w:t xml:space="preserve">5.1 Fundamentos — Os 7 Pilares de Qualidade</w:t>
-      </w:r>
-    </w:p>
-    <w:p>
-      <w:pPr>
-        <w:spacing w:after="160" w:line="288"/>
-        <w:jc w:val="both"/>
-      </w:pPr>
-      <w:r>
-        <w:rPr>
-          <w:sz w:val="22"/>
-          <w:szCs w:val="22"/>
-        </w:rPr>
-        <w:t xml:space="preserve">Toda ação assistencial do Serviço de Odontologia Oncológica do OSID é guiada por </w:t>
-      </w:r>
-      <w:r>
-        <w:rPr>
-          <w:b/>
-          <w:bCs/>
-          <w:sz w:val="22"/>
-          <w:szCs w:val="22"/>
-        </w:rPr>
-        <w:t xml:space="preserve">7 pilares de qualidade</w:t>
-      </w:r>
-      <w:r>
-        <w:rPr>
-          <w:sz w:val="22"/>
-          <w:szCs w:val="22"/>
-        </w:rPr>
-        <w:t xml:space="preserve"> que definem como a equipe trabalha:</w:t>
-      </w:r>
-    </w:p>
-    <w:p>
-      <w:pPr>
-        <w:spacing w:after="100" w:before="200"/>
-      </w:pPr>
-      <w:r>
-        <w:rPr>
-          <w:b/>
-          <w:bCs/>
-          <w:color w:val="2E5A87"/>
-          <w:sz w:val="21"/>
-          <w:szCs w:val="21"/>
-        </w:rPr>
-        <w:t xml:space="preserve">Pilar 1: Segurança do Paciente</w:t>
+        <w:t xml:space="preserve">5.1 Definição dos Padrões de Qualidade por Grupo de Risco</w:t>
       </w:r>
     </w:p>
     <w:p>
@@ -3008,7 +3005,7 @@
           <w:sz w:val="22"/>
           <w:szCs w:val="22"/>
         </w:rPr>
-        <w:t xml:space="preserve">Nenhuma ação que comprometa a integridade física, psicológica ou informativa do paciente</w:t>
+        <w:t xml:space="preserve">A Coordenadora, o Subcoordenador e os Dentistas reúnem-se para definir os critérios de qualidade aplicáveis a cada grupo de risco do Protocolo Clínico Assistencial (G1, G2, G3).</w:t>
       </w:r>
     </w:p>
     <w:p>
@@ -3025,481 +3022,7 @@
           <w:sz w:val="22"/>
           <w:szCs w:val="22"/>
         </w:rPr>
-        <w:t xml:space="preserve">Protocolos claros para prevenção de infecção, lesão ou complicação</w:t>
-      </w:r>
-    </w:p>
-    <w:p>
-      <w:pPr>
-        <w:pStyle w:val="ListParagraph"/>
-        <w:numPr>
-          <w:ilvl w:val="0"/>
-          <w:numId w:val="2"/>
-        </w:numPr>
-        <w:spacing w:after="80"/>
-      </w:pPr>
-      <w:r>
-        <w:rPr>
-          <w:sz w:val="22"/>
-          <w:szCs w:val="22"/>
-        </w:rPr>
-        <w:t xml:space="preserve">Comunicação honesta sobre riscos e benefícios</w:t>
-      </w:r>
-    </w:p>
-    <w:p>
-      <w:pPr>
-        <w:spacing w:after="100" w:before="200"/>
-      </w:pPr>
-      <w:r>
-        <w:rPr>
-          <w:b/>
-          <w:bCs/>
-          <w:color w:val="2E5A87"/>
-          <w:sz w:val="21"/>
-          <w:szCs w:val="21"/>
-        </w:rPr>
-        <w:t xml:space="preserve">Pilar 2: Excelência com Recursos Reais</w:t>
-      </w:r>
-    </w:p>
-    <w:p>
-      <w:pPr>
-        <w:pStyle w:val="ListParagraph"/>
-        <w:numPr>
-          <w:ilvl w:val="0"/>
-          <w:numId w:val="2"/>
-        </w:numPr>
-        <w:spacing w:after="80"/>
-      </w:pPr>
-      <w:r>
-        <w:rPr>
-          <w:sz w:val="22"/>
-          <w:szCs w:val="22"/>
-        </w:rPr>
-        <w:t xml:space="preserve">Decisões clínicas baseadas em melhor evidência disponível E restrições SUS (tempo, custo, materiais)</w:t>
-      </w:r>
-    </w:p>
-    <w:p>
-      <w:pPr>
-        <w:pStyle w:val="ListParagraph"/>
-        <w:numPr>
-          <w:ilvl w:val="0"/>
-          <w:numId w:val="2"/>
-        </w:numPr>
-        <w:spacing w:after="80"/>
-      </w:pPr>
-      <w:r>
-        <w:rPr>
-          <w:sz w:val="22"/>
-          <w:szCs w:val="22"/>
-        </w:rPr>
-        <w:t xml:space="preserve">Criatividade operacional para não comprometer qualidade</w:t>
-      </w:r>
-    </w:p>
-    <w:p>
-      <w:pPr>
-        <w:pStyle w:val="ListParagraph"/>
-        <w:numPr>
-          <w:ilvl w:val="0"/>
-          <w:numId w:val="2"/>
-        </w:numPr>
-        <w:spacing w:after="80"/>
-      </w:pPr>
-      <w:r>
-        <w:rPr>
-          <w:sz w:val="22"/>
-          <w:szCs w:val="22"/>
-        </w:rPr>
-        <w:t xml:space="preserve">Documentação clara do "por quê" de cada decisão</w:t>
-      </w:r>
-    </w:p>
-    <w:p>
-      <w:pPr>
-        <w:spacing w:after="100" w:before="200"/>
-      </w:pPr>
-      <w:r>
-        <w:rPr>
-          <w:b/>
-          <w:bCs/>
-          <w:color w:val="2E5A87"/>
-          <w:sz w:val="21"/>
-          <w:szCs w:val="21"/>
-        </w:rPr>
-        <w:t xml:space="preserve">Pilar 3: Decisão Colegiada e Transparente</w:t>
-      </w:r>
-    </w:p>
-    <w:p>
-      <w:pPr>
-        <w:pStyle w:val="ListParagraph"/>
-        <w:numPr>
-          <w:ilvl w:val="0"/>
-          <w:numId w:val="2"/>
-        </w:numPr>
-        <w:spacing w:after="80"/>
-      </w:pPr>
-      <w:r>
-        <w:rPr>
-          <w:sz w:val="22"/>
-          <w:szCs w:val="22"/>
-        </w:rPr>
-        <w:t xml:space="preserve">Equipe reúne-se para discutir casos complexos e definir condutas</w:t>
-      </w:r>
-    </w:p>
-    <w:p>
-      <w:pPr>
-        <w:pStyle w:val="ListParagraph"/>
-        <w:numPr>
-          <w:ilvl w:val="0"/>
-          <w:numId w:val="2"/>
-        </w:numPr>
-        <w:spacing w:after="80"/>
-      </w:pPr>
-      <w:r>
-        <w:rPr>
-          <w:sz w:val="22"/>
-          <w:szCs w:val="22"/>
-        </w:rPr>
-        <w:t xml:space="preserve">Cada membro tem voz; nenhuma decisão é imposta</w:t>
-      </w:r>
-    </w:p>
-    <w:p>
-      <w:pPr>
-        <w:pStyle w:val="ListParagraph"/>
-        <w:numPr>
-          <w:ilvl w:val="0"/>
-          <w:numId w:val="2"/>
-        </w:numPr>
-        <w:spacing w:after="80"/>
-      </w:pPr>
-      <w:r>
-        <w:rPr>
-          <w:sz w:val="22"/>
-          <w:szCs w:val="22"/>
-        </w:rPr>
-        <w:t xml:space="preserve">Paciente compreende a sequência lógica do atendimento</w:t>
-      </w:r>
-    </w:p>
-    <w:p>
-      <w:pPr>
-        <w:spacing w:after="100" w:before="200"/>
-      </w:pPr>
-      <w:r>
-        <w:rPr>
-          <w:b/>
-          <w:bCs/>
-          <w:color w:val="2E5A87"/>
-          <w:sz w:val="21"/>
-          <w:szCs w:val="21"/>
-        </w:rPr>
-        <w:t xml:space="preserve">Pilar 4: Equidade e Respeito</w:t>
-      </w:r>
-    </w:p>
-    <w:p>
-      <w:pPr>
-        <w:pStyle w:val="ListParagraph"/>
-        <w:numPr>
-          <w:ilvl w:val="0"/>
-          <w:numId w:val="2"/>
-        </w:numPr>
-        <w:spacing w:after="80"/>
-      </w:pPr>
-      <w:r>
-        <w:rPr>
-          <w:sz w:val="22"/>
-          <w:szCs w:val="22"/>
-        </w:rPr>
-        <w:t xml:space="preserve">Mesmo cuidado para todos, independente de escolaridade ou demanda inicial</w:t>
-      </w:r>
-    </w:p>
-    <w:p>
-      <w:pPr>
-        <w:pStyle w:val="ListParagraph"/>
-        <w:numPr>
-          <w:ilvl w:val="0"/>
-          <w:numId w:val="2"/>
-        </w:numPr>
-        <w:spacing w:after="80"/>
-      </w:pPr>
-      <w:r>
-        <w:rPr>
-          <w:sz w:val="22"/>
-          <w:szCs w:val="22"/>
-        </w:rPr>
-        <w:t xml:space="preserve">Respeito à dignidade, autonomia e contexto de vida do paciente</w:t>
-      </w:r>
-    </w:p>
-    <w:p>
-      <w:pPr>
-        <w:pStyle w:val="ListParagraph"/>
-        <w:numPr>
-          <w:ilvl w:val="0"/>
-          <w:numId w:val="2"/>
-        </w:numPr>
-        <w:spacing w:after="80"/>
-      </w:pPr>
-      <w:r>
-        <w:rPr>
-          <w:sz w:val="22"/>
-          <w:szCs w:val="22"/>
-        </w:rPr>
-        <w:t xml:space="preserve">Educação em saúde adaptada ao nível de compreensão</w:t>
-      </w:r>
-    </w:p>
-    <w:p>
-      <w:pPr>
-        <w:spacing w:after="100" w:before="200"/>
-      </w:pPr>
-      <w:r>
-        <w:rPr>
-          <w:b/>
-          <w:bCs/>
-          <w:color w:val="2E5A87"/>
-          <w:sz w:val="21"/>
-          <w:szCs w:val="21"/>
-        </w:rPr>
-        <w:t xml:space="preserve">Pilar 5: Documentação e Rastreabilidade</w:t>
-      </w:r>
-    </w:p>
-    <w:p>
-      <w:pPr>
-        <w:pStyle w:val="ListParagraph"/>
-        <w:numPr>
-          <w:ilvl w:val="0"/>
-          <w:numId w:val="2"/>
-        </w:numPr>
-        <w:spacing w:after="80"/>
-      </w:pPr>
-      <w:r>
-        <w:rPr>
-          <w:sz w:val="22"/>
-          <w:szCs w:val="22"/>
-        </w:rPr>
-        <w:t xml:space="preserve">Cada atendimento é registrado de forma completa e acessível</w:t>
-      </w:r>
-    </w:p>
-    <w:p>
-      <w:pPr>
-        <w:pStyle w:val="ListParagraph"/>
-        <w:numPr>
-          <w:ilvl w:val="0"/>
-          <w:numId w:val="2"/>
-        </w:numPr>
-        <w:spacing w:after="80"/>
-      </w:pPr>
-      <w:r>
-        <w:rPr>
-          <w:sz w:val="22"/>
-          <w:szCs w:val="22"/>
-        </w:rPr>
-        <w:t xml:space="preserve">Documentação evidencia decisões clínicas, resultados e aprendizados</w:t>
-      </w:r>
-    </w:p>
-    <w:p>
-      <w:pPr>
-        <w:pStyle w:val="ListParagraph"/>
-        <w:numPr>
-          <w:ilvl w:val="0"/>
-          <w:numId w:val="2"/>
-        </w:numPr>
-        <w:spacing w:after="80"/>
-      </w:pPr>
-      <w:r>
-        <w:rPr>
-          <w:sz w:val="22"/>
-          <w:szCs w:val="22"/>
-        </w:rPr>
-        <w:t xml:space="preserve">Segurança legal e continuidade do cuidado garantidas</w:t>
-      </w:r>
-    </w:p>
-    <w:p>
-      <w:pPr>
-        <w:spacing w:after="100" w:before="200"/>
-      </w:pPr>
-      <w:r>
-        <w:rPr>
-          <w:b/>
-          <w:bCs/>
-          <w:color w:val="2E5A87"/>
-          <w:sz w:val="21"/>
-          <w:szCs w:val="21"/>
-        </w:rPr>
-        <w:t xml:space="preserve">Pilar 6: Integração Multidisciplinar</w:t>
-      </w:r>
-    </w:p>
-    <w:p>
-      <w:pPr>
-        <w:pStyle w:val="ListParagraph"/>
-        <w:numPr>
-          <w:ilvl w:val="0"/>
-          <w:numId w:val="2"/>
-        </w:numPr>
-        <w:spacing w:after="80"/>
-      </w:pPr>
-      <w:r>
-        <w:rPr>
-          <w:sz w:val="22"/>
-          <w:szCs w:val="22"/>
-        </w:rPr>
-        <w:t xml:space="preserve">Comunicação clara com fonoaudiologia, fisioterapia, psicologia, oncologia, enfermagem</w:t>
-      </w:r>
-    </w:p>
-    <w:p>
-      <w:pPr>
-        <w:pStyle w:val="ListParagraph"/>
-        <w:numPr>
-          <w:ilvl w:val="0"/>
-          <w:numId w:val="2"/>
-        </w:numPr>
-        <w:spacing w:after="80"/>
-      </w:pPr>
-      <w:r>
-        <w:rPr>
-          <w:sz w:val="22"/>
-          <w:szCs w:val="22"/>
-        </w:rPr>
-        <w:t xml:space="preserve">Respeito às competências de cada especialidade</w:t>
-      </w:r>
-    </w:p>
-    <w:p>
-      <w:pPr>
-        <w:pStyle w:val="ListParagraph"/>
-        <w:numPr>
-          <w:ilvl w:val="0"/>
-          <w:numId w:val="2"/>
-        </w:numPr>
-        <w:spacing w:after="80"/>
-      </w:pPr>
-      <w:r>
-        <w:rPr>
-          <w:sz w:val="22"/>
-          <w:szCs w:val="22"/>
-        </w:rPr>
-        <w:t xml:space="preserve">Paciente recebe cuidado coordenado e coerente</w:t>
-      </w:r>
-    </w:p>
-    <w:p>
-      <w:pPr>
-        <w:spacing w:after="100" w:before="200"/>
-      </w:pPr>
-      <w:r>
-        <w:rPr>
-          <w:b/>
-          <w:bCs/>
-          <w:color w:val="2E5A87"/>
-          <w:sz w:val="21"/>
-          <w:szCs w:val="21"/>
-        </w:rPr>
-        <w:t xml:space="preserve">Pilar 7: Autonomia Técnica da Odontologia</w:t>
-      </w:r>
-    </w:p>
-    <w:p>
-      <w:pPr>
-        <w:pStyle w:val="ListParagraph"/>
-        <w:numPr>
-          <w:ilvl w:val="0"/>
-          <w:numId w:val="2"/>
-        </w:numPr>
-        <w:spacing w:after="80"/>
-      </w:pPr>
-      <w:r>
-        <w:rPr>
-          <w:sz w:val="22"/>
-          <w:szCs w:val="22"/>
-        </w:rPr>
-        <w:t xml:space="preserve">Reconhecimento de que saúde bucal é </w:t>
-      </w:r>
-      <w:r>
-        <w:rPr>
-          <w:b/>
-          <w:bCs/>
-          <w:sz w:val="22"/>
-          <w:szCs w:val="22"/>
-        </w:rPr>
-        <w:t xml:space="preserve">central</w:t>
-      </w:r>
-      <w:r>
-        <w:rPr>
-          <w:sz w:val="22"/>
-          <w:szCs w:val="22"/>
-        </w:rPr>
-        <w:t xml:space="preserve"> para qualidade de vida, nutrição e sucesso do tratamento oncológico</w:t>
-      </w:r>
-    </w:p>
-    <w:p>
-      <w:pPr>
-        <w:pStyle w:val="ListParagraph"/>
-        <w:numPr>
-          <w:ilvl w:val="0"/>
-          <w:numId w:val="2"/>
-        </w:numPr>
-        <w:spacing w:after="80"/>
-      </w:pPr>
-      <w:r>
-        <w:rPr>
-          <w:sz w:val="22"/>
-          <w:szCs w:val="22"/>
-        </w:rPr>
-        <w:t xml:space="preserve">Odontologia participa como especialidade co-responsável nas decisões</w:t>
-      </w:r>
-    </w:p>
-    <w:p>
-      <w:pPr>
-        <w:pStyle w:val="ListParagraph"/>
-        <w:numPr>
-          <w:ilvl w:val="0"/>
-          <w:numId w:val="2"/>
-        </w:numPr>
-        <w:spacing w:after="80"/>
-      </w:pPr>
-      <w:r>
-        <w:rPr>
-          <w:sz w:val="22"/>
-          <w:szCs w:val="22"/>
-        </w:rPr>
-        <w:t xml:space="preserve">Evidência clínica sustenta cada recomendação odontológica</w:t>
-      </w:r>
-    </w:p>
-    <w:p>
-      <w:pPr>
-        <w:pStyle w:val="Heading2"/>
-        <w:spacing w:after="120" w:before="240"/>
-      </w:pPr>
-      <w:r>
-        <w:rPr>
-          <w:b/>
-          <w:bCs/>
-          <w:color w:val="2E5A87"/>
-          <w:sz w:val="23"/>
-          <w:szCs w:val="23"/>
-        </w:rPr>
-        <w:t xml:space="preserve">5.2 Padrões de Qualidade por Grupo de Risco</w:t>
-      </w:r>
-    </w:p>
-    <w:p>
-      <w:pPr>
-        <w:spacing w:after="160" w:line="288"/>
-        <w:jc w:val="both"/>
-      </w:pPr>
-      <w:r>
-        <w:rPr>
-          <w:sz w:val="22"/>
-          <w:szCs w:val="22"/>
-        </w:rPr>
-        <w:t xml:space="preserve">A aplicação dos 7 pilares é </w:t>
-      </w:r>
-      <w:r>
-        <w:rPr>
-          <w:b/>
-          <w:bCs/>
-          <w:sz w:val="22"/>
-          <w:szCs w:val="22"/>
-        </w:rPr>
-        <w:t xml:space="preserve">individualizada conforme o grupo de risco</w:t>
-      </w:r>
-      <w:r>
-        <w:rPr>
-          <w:sz w:val="22"/>
-          <w:szCs w:val="22"/>
-        </w:rPr>
-        <w:t xml:space="preserve"> definido no Protocolo Clínico Assistencial, respeitando a condição oncológica, a fase do tratamento e a complicação oral predominante:</w:t>
+        <w:t xml:space="preserve">Estabelecem a frequência mínima de acompanhamento por grupo:</w:t>
       </w:r>
     </w:p>
     <w:tbl>
@@ -3604,7 +3127,7 @@
                 <w:sz w:val="20"/>
                 <w:szCs w:val="20"/>
               </w:rPr>
-              <w:t xml:space="preserve">Frequência mínima de acompanhamento</w:t>
+              <w:t xml:space="preserve">Frequência mínima</w:t>
             </w:r>
           </w:p>
         </w:tc>
@@ -3738,7 +3261,7 @@
                 <w:sz w:val="20"/>
                 <w:szCs w:val="20"/>
               </w:rPr>
-              <w:t xml:space="preserve">Avaliação odontológica antes do início da RT sempre que possível; manejo preventivo da MO</w:t>
+              <w:t xml:space="preserve">Avaliação odontológica antes do início da RT, sempre que possível; manejo preventivo da MO</w:t>
             </w:r>
           </w:p>
         </w:tc>
@@ -3928,7 +3451,7 @@
                 <w:sz w:val="20"/>
                 <w:szCs w:val="20"/>
               </w:rPr>
-              <w:t xml:space="preserve">Duas vezes por semana até regressão do quadro (intervalo pode aumentar conforme evolução clínica e logística do paciente)</w:t>
+              <w:t xml:space="preserve">Duas vezes por semana até regressão do quadro</w:t>
             </w:r>
           </w:p>
         </w:tc>
@@ -3954,7 +3477,7 @@
                 <w:sz w:val="20"/>
                 <w:szCs w:val="20"/>
               </w:rPr>
-              <w:t xml:space="preserve">Avaliação detalhada da área comprometida; documentação completa de FBML/aTFD; escalonamento precoce para equipe médica/cirúrgica quando indicado</w:t>
+              <w:t xml:space="preserve">Avaliação detalhada da área comprometida; documentação completa de FBML/aTFD; escalonamento precoce quando indicado</w:t>
             </w:r>
           </w:p>
         </w:tc>
@@ -3964,59 +3487,6 @@
       <w:pPr>
         <w:spacing w:before="160"/>
       </w:pPr>
-    </w:p>
-    <w:p>
-      <w:pPr>
-        <w:spacing w:after="160" w:line="288"/>
-        <w:jc w:val="both"/>
-      </w:pPr>
-      <w:r>
-        <w:rPr>
-          <w:b/>
-          <w:bCs/>
-          <w:sz w:val="22"/>
-          <w:szCs w:val="22"/>
-        </w:rPr>
-        <w:t xml:space="preserve">Critério de qualidade transversal:</w:t>
-      </w:r>
-      <w:r>
-        <w:rPr>
-          <w:sz w:val="22"/>
-          <w:szCs w:val="22"/>
-        </w:rPr>
-        <w:t xml:space="preserve"> todo atendimento a paciente G1, G2 ou G3 deve conter, no prontuário, o grupo de estratificação, a data da última avaliação e a conduta vigente — isso permite auditoria rápida da linha de cuidado.</w:t>
-      </w:r>
-    </w:p>
-    <w:p>
-      <w:pPr>
-        <w:pStyle w:val="Heading2"/>
-        <w:spacing w:after="120" w:before="240"/>
-      </w:pPr>
-      <w:r>
-        <w:rPr>
-          <w:b/>
-          <w:bCs/>
-          <w:color w:val="2E5A87"/>
-          <w:sz w:val="23"/>
-          <w:szCs w:val="23"/>
-        </w:rPr>
-        <w:t xml:space="preserve">5.3 Aplicação Operacional — Ciclo de Qualidade</w:t>
-      </w:r>
-    </w:p>
-    <w:p>
-      <w:pPr>
-        <w:spacing w:after="100" w:before="200"/>
-      </w:pPr>
-      <w:r>
-        <w:rPr>
-          <w:b/>
-          <w:bCs/>
-          <w:color w:val="2E5A87"/>
-          <w:sz w:val="21"/>
-          <w:szCs w:val="21"/>
-        </w:rPr>
-        <w:t xml:space="preserve">Passo 1: Planejamento e Definição de Padrões</w:t>
-      </w:r>
     </w:p>
     <w:p>
       <w:pPr>
@@ -4032,7 +3502,23 @@
           <w:sz w:val="22"/>
           <w:szCs w:val="22"/>
         </w:rPr>
-        <w:t xml:space="preserve">Coordenadora, Subcoordenador e Dentistas definem critérios específicos para cada tipo de atendimento (atendimento inicial, preparo pré-quimio, protocolo de mucosite, etc.), com base no Protocolo Clínico Assistencial</w:t>
+        <w:t xml:space="preserve">Registram os padrões definidos neste documento e os comunicam a toda a equipe em reunião.</w:t>
+      </w:r>
+    </w:p>
+    <w:p>
+      <w:pPr>
+        <w:pStyle w:val="Heading2"/>
+        <w:spacing w:after="120" w:before="240"/>
+      </w:pPr>
+      <w:r>
+        <w:rPr>
+          <w:b/>
+          <w:bCs/>
+          <w:color w:val="2E5A87"/>
+          <w:sz w:val="23"/>
+          <w:szCs w:val="23"/>
+        </w:rPr>
+        <w:t xml:space="preserve">5.2 Avaliação Odontológica Inicial e Classificação de Risco</w:t>
       </w:r>
     </w:p>
     <w:p>
@@ -4049,7 +3535,7 @@
           <w:sz w:val="22"/>
           <w:szCs w:val="22"/>
         </w:rPr>
-        <w:t xml:space="preserve">Critérios são documentados em POPs específicos</w:t>
+        <w:t xml:space="preserve">O Dentista responsável realiza a avaliação odontológica inicial do paciente, conforme roteiro do Protocolo Clínico Assistencial.</w:t>
       </w:r>
     </w:p>
     <w:p>
@@ -4066,22 +3552,7 @@
           <w:sz w:val="22"/>
           <w:szCs w:val="22"/>
         </w:rPr>
-        <w:t xml:space="preserve">Critérios são comunicados e discutidos com toda equipe</w:t>
-      </w:r>
-    </w:p>
-    <w:p>
-      <w:pPr>
-        <w:spacing w:after="100" w:before="200"/>
-      </w:pPr>
-      <w:r>
-        <w:rPr>
-          <w:b/>
-          <w:bCs/>
-          <w:color w:val="2E5A87"/>
-          <w:sz w:val="21"/>
-          <w:szCs w:val="21"/>
-        </w:rPr>
-        <w:t xml:space="preserve">Passo 2: Execução Conforme Padrão</w:t>
+        <w:t xml:space="preserve">Classifica o paciente no grupo de risco correspondente (G1, G2 ou G3).</w:t>
       </w:r>
     </w:p>
     <w:p>
@@ -4098,7 +3569,7 @@
           <w:sz w:val="22"/>
           <w:szCs w:val="22"/>
         </w:rPr>
-        <w:t xml:space="preserve">Cada profissional aplica os critérios definidos em cada atendimento</w:t>
+        <w:t xml:space="preserve">Registra a avaliação completa no prontuário (Formulário OSID-PRONT-001), incluindo grupo de risco, data da avaliação e conduta definida.</w:t>
       </w:r>
     </w:p>
     <w:p>
@@ -4115,7 +3586,39 @@
           <w:sz w:val="22"/>
           <w:szCs w:val="22"/>
         </w:rPr>
-        <w:t xml:space="preserve">Documentação completa é feita em tempo real (prontuário eletrônico ou impresso)</w:t>
+        <w:t xml:space="preserve">Se o paciente for do grupo G1, o Dentista responsável verifica se a avaliação está ocorrendo </w:t>
+      </w:r>
+      <w:r>
+        <w:rPr>
+          <w:b/>
+          <w:bCs/>
+          <w:sz w:val="22"/>
+          <w:szCs w:val="22"/>
+        </w:rPr>
+        <w:t xml:space="preserve">antes do início da radioterapia</w:t>
+      </w:r>
+      <w:r>
+        <w:rPr>
+          <w:sz w:val="22"/>
+          <w:szCs w:val="22"/>
+        </w:rPr>
+        <w:t xml:space="preserve">; se a RT já foi iniciada, registra o motivo do atraso.</w:t>
+      </w:r>
+    </w:p>
+    <w:p>
+      <w:pPr>
+        <w:pStyle w:val="Heading2"/>
+        <w:spacing w:after="120" w:before="240"/>
+      </w:pPr>
+      <w:r>
+        <w:rPr>
+          <w:b/>
+          <w:bCs/>
+          <w:color w:val="2E5A87"/>
+          <w:sz w:val="23"/>
+          <w:szCs w:val="23"/>
+        </w:rPr>
+        <w:t xml:space="preserve">5.3 Execução do Atendimento e Documentação</w:t>
       </w:r>
     </w:p>
     <w:p>
@@ -4132,23 +3635,7 @@
           <w:sz w:val="22"/>
           <w:szCs w:val="22"/>
         </w:rPr>
-        <w:t xml:space="preserve">Toda sessão de FBML/aTFD é registrada com comprimento de onda, potência, energia por ponto, área do spot, número e localização dos pontos, e resposta clínica — sem esse registro, a sessão é considerada </w:t>
-      </w:r>
-      <w:r>
-        <w:rPr>
-          <w:b/>
-          <w:bCs/>
-          <w:sz w:val="22"/>
-          <w:szCs w:val="22"/>
-        </w:rPr>
-        <w:t xml:space="preserve">não documentada</w:t>
-      </w:r>
-      <w:r>
-        <w:rPr>
-          <w:sz w:val="22"/>
-          <w:szCs w:val="22"/>
-        </w:rPr>
-        <w:t xml:space="preserve"> para fins de qualidade</w:t>
+        <w:t xml:space="preserve">O Dentista responsável aplica a conduta clínica definida, respeitando a frequência de acompanhamento do grupo (Seção 5.1).</w:t>
       </w:r>
     </w:p>
     <w:p>
@@ -4165,22 +3652,7 @@
           <w:sz w:val="22"/>
           <w:szCs w:val="22"/>
         </w:rPr>
-        <w:t xml:space="preserve">Dificuldades operacionais são reportadas ao Subcoordenador ou Coordenadora</w:t>
-      </w:r>
-    </w:p>
-    <w:p>
-      <w:pPr>
-        <w:spacing w:after="100" w:before="200"/>
-      </w:pPr>
-      <w:r>
-        <w:rPr>
-          <w:b/>
-          <w:bCs/>
-          <w:color w:val="2E5A87"/>
-          <w:sz w:val="21"/>
-          <w:szCs w:val="21"/>
-        </w:rPr>
-        <w:t xml:space="preserve">Passo 3: Monitoramento Mensal de Indicadores</w:t>
+        <w:t xml:space="preserve">Documenta o atendimento em tempo real no prontuário.</w:t>
       </w:r>
     </w:p>
     <w:p>
@@ -4197,7 +3669,7 @@
           <w:sz w:val="22"/>
           <w:szCs w:val="22"/>
         </w:rPr>
-        <w:t xml:space="preserve">Coordenadora calcula indicadores de qualidade (exemplo: % de atendimentos completamente documentados, % de pacientes que compreenderam o plano, tempo médio de atendimento inicial)</w:t>
+        <w:t xml:space="preserve">Quando há aplicação de FBML ou aTFD, registra a sessão no Formulário OSID-FBML-001, com comprimento de onda, potência, energia por ponto, número e localização dos pontos, e resposta clínica.</w:t>
       </w:r>
     </w:p>
     <w:p>
@@ -4214,7 +3686,23 @@
           <w:sz w:val="22"/>
           <w:szCs w:val="22"/>
         </w:rPr>
-        <w:t xml:space="preserve">Dados são apresentados à equipe em reunião mensal</w:t>
+        <w:t xml:space="preserve">Se a documentação estiver incompleta ao final do atendimento, o Dentista responsável completa o registro antes do encerramento do expediente — sem isso, a sessão é considerada </w:t>
+      </w:r>
+      <w:r>
+        <w:rPr>
+          <w:b/>
+          <w:bCs/>
+          <w:sz w:val="22"/>
+          <w:szCs w:val="22"/>
+        </w:rPr>
+        <w:t xml:space="preserve">não documentada</w:t>
+      </w:r>
+      <w:r>
+        <w:rPr>
+          <w:sz w:val="22"/>
+          <w:szCs w:val="22"/>
+        </w:rPr>
+        <w:t xml:space="preserve"> para fins de qualidade.</w:t>
       </w:r>
     </w:p>
     <w:p>
@@ -4231,22 +3719,23 @@
           <w:sz w:val="22"/>
           <w:szCs w:val="22"/>
         </w:rPr>
-        <w:t xml:space="preserve">Equipe discute: estamos no alvo? O que está funcionando? O que precisa melhorar?</w:t>
-      </w:r>
-    </w:p>
-    <w:p>
-      <w:pPr>
-        <w:spacing w:after="100" w:before="200"/>
+        <w:t xml:space="preserve">Dificuldades operacionais identificadas durante o atendimento são reportadas ao Subcoordenador ou à Coordenadora.</w:t>
+      </w:r>
+    </w:p>
+    <w:p>
+      <w:pPr>
+        <w:pStyle w:val="Heading2"/>
+        <w:spacing w:after="120" w:before="240"/>
       </w:pPr>
       <w:r>
         <w:rPr>
           <w:b/>
           <w:bCs/>
           <w:color w:val="2E5A87"/>
-          <w:sz w:val="21"/>
-          <w:szCs w:val="21"/>
-        </w:rPr>
-        <w:t xml:space="preserve">Passo 4: Discussão Colegiada de Casos Complexos</w:t>
+          <w:sz w:val="23"/>
+          <w:szCs w:val="23"/>
+        </w:rPr>
+        <w:t xml:space="preserve">5.4 Escalonamento à Equipe Multidisciplinar</w:t>
       </w:r>
     </w:p>
     <w:p>
@@ -4263,7 +3752,97 @@
           <w:sz w:val="22"/>
           <w:szCs w:val="22"/>
         </w:rPr>
-        <w:t xml:space="preserve">Casos com desfechos inesperados ou decisões difíceis são levados à equipe</w:t>
+        <w:t xml:space="preserve">O Dentista responsável identifica, durante o atendimento, a necessidade de encaminhamento a outra especialidade, conforme os critérios:</w:t>
+      </w:r>
+    </w:p>
+    <w:p>
+      <w:pPr>
+        <w:pStyle w:val="ListParagraph"/>
+        <w:numPr>
+          <w:ilvl w:val="0"/>
+          <w:numId w:val="2"/>
+        </w:numPr>
+        <w:spacing w:after="60"/>
+        <w:ind w:left="1080"/>
+      </w:pPr>
+      <w:r>
+        <w:rPr>
+          <w:sz w:val="22"/>
+          <w:szCs w:val="22"/>
+        </w:rPr>
+        <w:t xml:space="preserve">Nutrição: dor ou mucosite comprometendo a ingestão alimentar</w:t>
+      </w:r>
+    </w:p>
+    <w:p>
+      <w:pPr>
+        <w:pStyle w:val="ListParagraph"/>
+        <w:numPr>
+          <w:ilvl w:val="0"/>
+          <w:numId w:val="2"/>
+        </w:numPr>
+        <w:spacing w:after="60"/>
+        <w:ind w:left="1080"/>
+      </w:pPr>
+      <w:r>
+        <w:rPr>
+          <w:sz w:val="22"/>
+          <w:szCs w:val="22"/>
+        </w:rPr>
+        <w:t xml:space="preserve">Fonoaudiologia: alteração de deglutição, mastigação, fala ou função orofacial</w:t>
+      </w:r>
+    </w:p>
+    <w:p>
+      <w:pPr>
+        <w:pStyle w:val="ListParagraph"/>
+        <w:numPr>
+          <w:ilvl w:val="0"/>
+          <w:numId w:val="2"/>
+        </w:numPr>
+        <w:spacing w:after="60"/>
+        <w:ind w:left="1080"/>
+      </w:pPr>
+      <w:r>
+        <w:rPr>
+          <w:sz w:val="22"/>
+          <w:szCs w:val="22"/>
+        </w:rPr>
+        <w:t xml:space="preserve">Psicologia: sinais de sofrimento psíquico, ansiedade ou dificuldade de adesão ao tratamento</w:t>
+      </w:r>
+    </w:p>
+    <w:p>
+      <w:pPr>
+        <w:pStyle w:val="ListParagraph"/>
+        <w:numPr>
+          <w:ilvl w:val="0"/>
+          <w:numId w:val="2"/>
+        </w:numPr>
+        <w:spacing w:after="60"/>
+        <w:ind w:left="1080"/>
+      </w:pPr>
+      <w:r>
+        <w:rPr>
+          <w:sz w:val="22"/>
+          <w:szCs w:val="22"/>
+        </w:rPr>
+        <w:t xml:space="preserve">Fisioterapia: trismo, limitação de abertura bucal ou edema/linfedema de CP</w:t>
+      </w:r>
+    </w:p>
+    <w:p>
+      <w:pPr>
+        <w:pStyle w:val="ListParagraph"/>
+        <w:numPr>
+          <w:ilvl w:val="0"/>
+          <w:numId w:val="2"/>
+        </w:numPr>
+        <w:spacing w:after="60"/>
+        <w:ind w:left="1080"/>
+      </w:pPr>
+      <w:r>
+        <w:rPr>
+          <w:sz w:val="22"/>
+          <w:szCs w:val="22"/>
+        </w:rPr>
+        <w:t xml:space="preserve">Equipe médica/cirúrgica de CP: suspeita de recorrência/progressão tumoral, ou ORN/OAM complexa</w:t>
       </w:r>
     </w:p>
     <w:p>
@@ -4280,7 +3859,7 @@
           <w:sz w:val="22"/>
           <w:szCs w:val="22"/>
         </w:rPr>
-        <w:t xml:space="preserve">Discussão segue formato: situação clínica → evidência científica → decisão tomada → resultado → aprendizado</w:t>
+        <w:t xml:space="preserve">Registra o encaminhamento no prontuário (Formulário OSID-INTEG-001), com data e motivo.</w:t>
       </w:r>
     </w:p>
     <w:p>
@@ -4297,22 +3876,23 @@
           <w:sz w:val="22"/>
           <w:szCs w:val="22"/>
         </w:rPr>
-        <w:t xml:space="preserve">Nenhuma culpabilização; foco em aprender junto</w:t>
-      </w:r>
-    </w:p>
-    <w:p>
-      <w:pPr>
-        <w:spacing w:after="100" w:before="200"/>
+        <w:t xml:space="preserve">Comunica a especialidade correspondente.</w:t>
+      </w:r>
+    </w:p>
+    <w:p>
+      <w:pPr>
+        <w:pStyle w:val="Heading2"/>
+        <w:spacing w:after="120" w:before="240"/>
       </w:pPr>
       <w:r>
         <w:rPr>
           <w:b/>
           <w:bCs/>
           <w:color w:val="2E5A87"/>
-          <w:sz w:val="21"/>
-          <w:szCs w:val="21"/>
-        </w:rPr>
-        <w:t xml:space="preserve">Passo 5: Ajuste Contínuo</w:t>
+          <w:sz w:val="23"/>
+          <w:szCs w:val="23"/>
+        </w:rPr>
+        <w:t xml:space="preserve">5.5 Monitoramento Mensal de Indicadores</w:t>
       </w:r>
     </w:p>
     <w:p>
@@ -4329,7 +3909,7 @@
           <w:sz w:val="22"/>
           <w:szCs w:val="22"/>
         </w:rPr>
-        <w:t xml:space="preserve">Com base em monitoramento e discussões, ajustes são propostos</w:t>
+        <w:t xml:space="preserve">A Coordenadora consolida, ao final de cada mês, os indicadores de qualidade do Serviço (documentação completa, adesão à frequência por grupo, documentação de FBML/aTFD, avaliação pré-RT, compreensão do paciente, escalonamento oportuno — ver Seção 7).</w:t>
       </w:r>
     </w:p>
     <w:p>
@@ -4346,7 +3926,7 @@
           <w:sz w:val="22"/>
           <w:szCs w:val="22"/>
         </w:rPr>
-        <w:t xml:space="preserve">Mudanças são testadas, avaliadas e documentadas</w:t>
+        <w:t xml:space="preserve">Registra os resultados no Relatório Mensal de Indicadores (Formulário OSID-REL-MEN-001).</w:t>
       </w:r>
     </w:p>
     <w:p>
@@ -4363,52 +3943,7 @@
           <w:sz w:val="22"/>
           <w:szCs w:val="22"/>
         </w:rPr>
-        <w:t xml:space="preserve">Ciclo reinicia</w:t>
-      </w:r>
-    </w:p>
-    <w:p>
-      <w:pPr>
-        <w:pStyle w:val="Heading2"/>
-        <w:spacing w:after="120" w:before="240"/>
-      </w:pPr>
-      <w:r>
-        <w:rPr>
-          <w:b/>
-          <w:bCs/>
-          <w:color w:val="2E5A87"/>
-          <w:sz w:val="23"/>
-          <w:szCs w:val="23"/>
-        </w:rPr>
-        <w:t xml:space="preserve">5.4 Integração Multidisciplinar — Critérios de Escalonamento</w:t>
-      </w:r>
-    </w:p>
-    <w:p>
-      <w:pPr>
-        <w:spacing w:after="160" w:line="288"/>
-        <w:jc w:val="both"/>
-      </w:pPr>
-      <w:r>
-        <w:rPr>
-          <w:sz w:val="22"/>
-          <w:szCs w:val="22"/>
-        </w:rPr>
-        <w:t xml:space="preserve">A qualidade do cuidado odonto-oncológico depende de comunicação oportuna com a equipe multidisciplinar (ver responsabilidades na Seção 3). Para fins de qualidade, define-se </w:t>
-      </w:r>
-      <w:r>
-        <w:rPr>
-          <w:b/>
-          <w:bCs/>
-          <w:sz w:val="22"/>
-          <w:szCs w:val="22"/>
-        </w:rPr>
-        <w:t xml:space="preserve">quando</w:t>
-      </w:r>
-      <w:r>
-        <w:rPr>
-          <w:sz w:val="22"/>
-          <w:szCs w:val="22"/>
-        </w:rPr>
-        <w:t xml:space="preserve"> o escalonamento é obrigatório:</w:t>
+        <w:t xml:space="preserve">Apresenta os resultados à equipe em reunião mensal.</w:t>
       </w:r>
     </w:p>
     <w:p>
@@ -4422,19 +3957,26 @@
       </w:pPr>
       <w:r>
         <w:rPr>
+          <w:sz w:val="22"/>
+          <w:szCs w:val="22"/>
+        </w:rPr>
+        <w:t xml:space="preserve">Se algum indicador estiver abaixo da meta, a equipe discute a causa e define uma ação de correção, registrada na Ata de Reunião.</w:t>
+      </w:r>
+    </w:p>
+    <w:p>
+      <w:pPr>
+        <w:pStyle w:val="Heading2"/>
+        <w:spacing w:after="120" w:before="240"/>
+      </w:pPr>
+      <w:r>
+        <w:rPr>
           <w:b/>
           <w:bCs/>
-          <w:sz w:val="22"/>
-          <w:szCs w:val="22"/>
-        </w:rPr>
-        <w:t xml:space="preserve">Para Nutrição:</w:t>
-      </w:r>
-      <w:r>
-        <w:rPr>
-          <w:sz w:val="22"/>
-          <w:szCs w:val="22"/>
-        </w:rPr>
-        <w:t xml:space="preserve"> paciente com dor/mucosite comprometendo ingestão alimentar</w:t>
+          <w:color w:val="2E5A87"/>
+          <w:sz w:val="23"/>
+          <w:szCs w:val="23"/>
+        </w:rPr>
+        <w:t xml:space="preserve">5.6 Discussão Colegiada de Casos Complexos</w:t>
       </w:r>
     </w:p>
     <w:p>
@@ -4448,19 +3990,10 @@
       </w:pPr>
       <w:r>
         <w:rPr>
-          <w:b/>
-          <w:bCs/>
-          <w:sz w:val="22"/>
-          <w:szCs w:val="22"/>
-        </w:rPr>
-        <w:t xml:space="preserve">Para Fonoaudiologia:</w:t>
-      </w:r>
-      <w:r>
-        <w:rPr>
-          <w:sz w:val="22"/>
-          <w:szCs w:val="22"/>
-        </w:rPr>
-        <w:t xml:space="preserve"> alteração de deglutição, mastigação, fala ou função orofacial identificada no exame odontológico</w:t>
+          <w:sz w:val="22"/>
+          <w:szCs w:val="22"/>
+        </w:rPr>
+        <w:t xml:space="preserve">Qualquer membro da equipe pode levar um caso complexo (gravidade elevada, paciente G3, dúvida diagnóstica ou desfecho inesperado) para discussão em equipe.</w:t>
       </w:r>
     </w:p>
     <w:p>
@@ -4474,19 +4007,10 @@
       </w:pPr>
       <w:r>
         <w:rPr>
-          <w:b/>
-          <w:bCs/>
-          <w:sz w:val="22"/>
-          <w:szCs w:val="22"/>
-        </w:rPr>
-        <w:t xml:space="preserve">Para Psicologia:</w:t>
-      </w:r>
-      <w:r>
-        <w:rPr>
-          <w:sz w:val="22"/>
-          <w:szCs w:val="22"/>
-        </w:rPr>
-        <w:t xml:space="preserve"> sinais de sofrimento psíquico, ansiedade ou dificuldade de adesão ao tratamento</w:t>
+          <w:sz w:val="22"/>
+          <w:szCs w:val="22"/>
+        </w:rPr>
+        <w:t xml:space="preserve">A discussão segue a sequência: situação clínica → evidência científica → decisão tomada → resultado → aprendizado.</w:t>
       </w:r>
     </w:p>
     <w:p>
@@ -4500,19 +4024,10 @@
       </w:pPr>
       <w:r>
         <w:rPr>
-          <w:b/>
-          <w:bCs/>
-          <w:sz w:val="22"/>
-          <w:szCs w:val="22"/>
-        </w:rPr>
-        <w:t xml:space="preserve">Para Fisioterapia:</w:t>
-      </w:r>
-      <w:r>
-        <w:rPr>
-          <w:sz w:val="22"/>
-          <w:szCs w:val="22"/>
-        </w:rPr>
-        <w:t xml:space="preserve"> trismo, limitação de abertura bucal ou edema/linfedema de CP</w:t>
+          <w:sz w:val="22"/>
+          <w:szCs w:val="22"/>
+        </w:rPr>
+        <w:t xml:space="preserve">A Coordenadora ou o Subcoordenador registram a discussão e a decisão na Ata de Reunião (Formulário OSID-ATA-001).</w:t>
       </w:r>
     </w:p>
     <w:p>
@@ -4526,32 +4041,94 @@
       </w:pPr>
       <w:r>
         <w:rPr>
+          <w:sz w:val="22"/>
+          <w:szCs w:val="22"/>
+        </w:rPr>
+        <w:t xml:space="preserve">Não há culpabilização individual; o foco é o aprendizado coletivo.</w:t>
+      </w:r>
+    </w:p>
+    <w:p>
+      <w:pPr>
+        <w:pStyle w:val="Heading2"/>
+        <w:spacing w:after="120" w:before="240"/>
+      </w:pPr>
+      <w:r>
+        <w:rPr>
           <w:b/>
           <w:bCs/>
-          <w:sz w:val="22"/>
-          <w:szCs w:val="22"/>
-        </w:rPr>
-        <w:t xml:space="preserve">Para Equipe médica/cirúrgica de CP:</w:t>
-      </w:r>
-      <w:r>
-        <w:rPr>
-          <w:sz w:val="22"/>
-          <w:szCs w:val="22"/>
-        </w:rPr>
-        <w:t xml:space="preserve"> suspeita de recorrência/progressão tumoral, ORN/OAM complexa, ou necessidade de abordagem cirúrgica</w:t>
-      </w:r>
-    </w:p>
-    <w:p>
-      <w:pPr>
-        <w:spacing w:after="160" w:line="288"/>
-        <w:jc w:val="both"/>
-      </w:pPr>
-      <w:r>
-        <w:rPr>
-          <w:sz w:val="22"/>
-          <w:szCs w:val="22"/>
-        </w:rPr>
-        <w:t xml:space="preserve">Todo encaminhamento é registrado em prontuário, com data e motivo — isso é o que permite auditar se a integração multidisciplinar está de fato acontecendo (ver indicador na Seção 7).</w:t>
+          <w:color w:val="2E5A87"/>
+          <w:sz w:val="23"/>
+          <w:szCs w:val="23"/>
+        </w:rPr>
+        <w:t xml:space="preserve">5.7 Ajuste Contínuo do Procedimento</w:t>
+      </w:r>
+    </w:p>
+    <w:p>
+      <w:pPr>
+        <w:pStyle w:val="ListParagraph"/>
+        <w:numPr>
+          <w:ilvl w:val="0"/>
+          <w:numId w:val="2"/>
+        </w:numPr>
+        <w:spacing w:after="80"/>
+      </w:pPr>
+      <w:r>
+        <w:rPr>
+          <w:sz w:val="22"/>
+          <w:szCs w:val="22"/>
+        </w:rPr>
+        <w:t xml:space="preserve">Com base no monitoramento mensal (5.5) e nas discussões de casos (5.6), a equipe propõe ajustes aos padrões de qualidade.</w:t>
+      </w:r>
+    </w:p>
+    <w:p>
+      <w:pPr>
+        <w:pStyle w:val="ListParagraph"/>
+        <w:numPr>
+          <w:ilvl w:val="0"/>
+          <w:numId w:val="2"/>
+        </w:numPr>
+        <w:spacing w:after="80"/>
+      </w:pPr>
+      <w:r>
+        <w:rPr>
+          <w:sz w:val="22"/>
+          <w:szCs w:val="22"/>
+        </w:rPr>
+        <w:t xml:space="preserve">Se a Coordenadora aprova o ajuste, ele é testado, documentado e incorporado a este procedimento.</w:t>
+      </w:r>
+    </w:p>
+    <w:p>
+      <w:pPr>
+        <w:pStyle w:val="ListParagraph"/>
+        <w:numPr>
+          <w:ilvl w:val="0"/>
+          <w:numId w:val="2"/>
+        </w:numPr>
+        <w:spacing w:after="80"/>
+      </w:pPr>
+      <w:r>
+        <w:rPr>
+          <w:sz w:val="22"/>
+          <w:szCs w:val="22"/>
+        </w:rPr>
+        <w:t xml:space="preserve">Se o ajuste não funcionar como esperado, a equipe retoma a discussão e propõe uma alternativa.</w:t>
+      </w:r>
+    </w:p>
+    <w:p>
+      <w:pPr>
+        <w:pStyle w:val="ListParagraph"/>
+        <w:numPr>
+          <w:ilvl w:val="0"/>
+          <w:numId w:val="2"/>
+        </w:numPr>
+        <w:spacing w:after="80"/>
+      </w:pPr>
+      <w:r>
+        <w:rPr>
+          <w:sz w:val="22"/>
+          <w:szCs w:val="22"/>
+        </w:rPr>
+        <w:t xml:space="preserve">Toda alteração é registrada no Histórico de Revisões (Seção 10).</w:t>
       </w:r>
     </w:p>
     <w:p>
@@ -7286,6 +6863,112 @@
                 <w:szCs w:val="20"/>
               </w:rPr>
               <w:t xml:space="preserve">2.0</w:t>
+            </w:r>
+          </w:p>
+        </w:tc>
+      </w:tr>
+      <w:tr>
+        <w:tc>
+          <w:tcPr>
+            <w:tcW w:type="dxa" w:w="1500"/>
+            <w:tcMar>
+              <w:top w:type="dxa" w:w="80"/>
+              <w:left w:type="dxa" w:w="100"/>
+              <w:bottom w:type="dxa" w:w="80"/>
+              <w:right w:type="dxa" w:w="100"/>
+            </w:tcMar>
+            <w:vAlign w:val="center"/>
+          </w:tcPr>
+          <w:p>
+            <w:pPr>
+              <w:jc w:val="left"/>
+            </w:pPr>
+            <w:r>
+              <w:rPr>
+                <w:b w:val="false"/>
+                <w:bCs w:val="false"/>
+                <w:sz w:val="20"/>
+                <w:szCs w:val="20"/>
+              </w:rPr>
+              <w:t xml:space="preserve">28/09/2026</w:t>
+            </w:r>
+          </w:p>
+        </w:tc>
+        <w:tc>
+          <w:tcPr>
+            <w:tcW w:type="dxa" w:w="2200"/>
+            <w:tcMar>
+              <w:top w:type="dxa" w:w="80"/>
+              <w:left w:type="dxa" w:w="100"/>
+              <w:bottom w:type="dxa" w:w="80"/>
+              <w:right w:type="dxa" w:w="100"/>
+            </w:tcMar>
+            <w:vAlign w:val="center"/>
+          </w:tcPr>
+          <w:p>
+            <w:pPr>
+              <w:jc w:val="left"/>
+            </w:pPr>
+            <w:r>
+              <w:rPr>
+                <w:b w:val="false"/>
+                <w:bCs w:val="false"/>
+                <w:sz w:val="20"/>
+                <w:szCs w:val="20"/>
+              </w:rPr>
+              <w:t xml:space="preserve">Título e Seção 5</w:t>
+            </w:r>
+          </w:p>
+        </w:tc>
+        <w:tc>
+          <w:tcPr>
+            <w:tcW w:type="dxa" w:w="4460"/>
+            <w:tcMar>
+              <w:top w:type="dxa" w:w="80"/>
+              <w:left w:type="dxa" w:w="100"/>
+              <w:bottom w:type="dxa" w:w="80"/>
+              <w:right w:type="dxa" w:w="100"/>
+            </w:tcMar>
+            <w:vAlign w:val="center"/>
+          </w:tcPr>
+          <w:p>
+            <w:pPr>
+              <w:jc w:val="left"/>
+            </w:pPr>
+            <w:r>
+              <w:rPr>
+                <w:b w:val="false"/>
+                <w:bCs w:val="false"/>
+                <w:sz w:val="20"/>
+                <w:szCs w:val="20"/>
+              </w:rPr>
+              <w:t xml:space="preserve">Reclassificado de Procedimento Operacional Padrão para Procedimento Gerencial (distinção formal OSID); Seção 5 reescrita em etapas numeradas de ação, conforme modelo institucional</w:t>
+            </w:r>
+          </w:p>
+        </w:tc>
+        <w:tc>
+          <w:tcPr>
+            <w:tcW w:type="dxa" w:w="1200"/>
+            <w:tcMar>
+              <w:top w:type="dxa" w:w="80"/>
+              <w:left w:type="dxa" w:w="100"/>
+              <w:bottom w:type="dxa" w:w="80"/>
+              <w:right w:type="dxa" w:w="100"/>
+            </w:tcMar>
+            <w:vAlign w:val="center"/>
+          </w:tcPr>
+          <w:p>
+            <w:pPr>
+              <w:jc w:val="left"/>
+            </w:pPr>
+            <w:r>
+              <w:rPr>
+                <w:b w:val="false"/>
+                <w:bCs w:val="false"/>
+                <w:sz w:val="20"/>
+                <w:szCs w:val="20"/>
+              </w:rPr>
+              <w:t xml:space="preserve">3.0</w:t>
             </w:r>
           </w:p>
         </w:tc>
@@ -7497,7 +7180,7 @@
         <w:sz w:val="16"/>
         <w:szCs w:val="16"/>
       </w:rPr>
-      <w:t xml:space="preserve">OSID · Odontologia Oncológica · POP Qualidade v2.0</w:t>
+      <w:t xml:space="preserve">OSID · Odontologia Oncológica · Procedimento Gerencial Qualidade v3.0</w:t>
     </w:r>
   </w:p>
 </w:hdr>

</xml_diff>

<commit_message>
Corrigir nome: Manoela (não Manuela) em todos os documentos
- perfil-lider.md, POP de Qualidade OSID (.md e .docx) e Escala de Férias (.xlsx)
Co-Authored-By: Claude Sonnet 5 <noreply@anthropic.com>
Claude-Session: https://claude.ai/code/session_013f2XRhDo2k4tpqWLL7XirX
</commit_message>
<xml_diff>
--- a/meu-projeto/POP-Qualidade-OSID.docx
+++ b/meu-projeto/POP-Qualidade-OSID.docx
@@ -146,7 +146,7 @@
           <w:sz w:val="20"/>
           <w:szCs w:val="20"/>
         </w:rPr>
-        <w:t xml:space="preserve">Elaborado por: Manuela Carrera — Coordenadora</w:t>
+        <w:t xml:space="preserve">Elaborado por: Manoela Carrera — Coordenadora</w:t>
       </w:r>
     </w:p>
     <w:p>
@@ -649,7 +649,7 @@
                 <w:sz w:val="20"/>
                 <w:szCs w:val="20"/>
               </w:rPr>
-              <w:t xml:space="preserve">Coordenadora — Manuela Carrera</w:t>
+              <w:t xml:space="preserve">Coordenadora — Manoela Carrera</w:t>
             </w:r>
           </w:p>
         </w:tc>
@@ -7005,7 +7005,7 @@
           <w:sz w:val="20"/>
           <w:szCs w:val="20"/>
         </w:rPr>
-        <w:t xml:space="preserve">Manuela Carrera — Coordenadora, Equipe de Odontologia Oncológica OSID</w:t>
+        <w:t xml:space="preserve">Manoela Carrera — Coordenadora, Equipe de Odontologia Oncológica OSID</w:t>
       </w:r>
     </w:p>
     <w:p>

</xml_diff>